<commit_message>
feat: replace printer example with four practical prompt cases
Co-Authored-By: Codex <noreply@openai.com>
</commit_message>
<xml_diff>
--- a/data/cases/report.docx
+++ b/data/cases/report.docx
@@ -13,11 +13,6 @@
       </w:pPr>
       <w:r>
         <w:t>Краткое резюме отчёта для руководителя</w:t>
-      </w:r>
-    </w:p>
-    <w:p>
-      <w:r>
-        <w:t>СИНТЕТИЧЕСКИЕ УЧЕБНЫЕ ДАННЫЕ. Все организации, показатели, правила и обстоятельства придуманы. Не являются документами Концерна.</w:t>
       </w:r>
     </w:p>
     <w:p>

</xml_diff>